<commit_message>
dashboard+report+workspace: KM07/KM08 pilots in (~36 deep-floor, ~67 bimodal), KM09 v1.1 re-centered on sepsis-principal trap, execution queue + throughput note staged
Dashboard (km-world-dashboard.html):
- KM07 data: mean ~36 (approx), job cf205fcc, spread ~nine 30-40 floors + one 78 catch (run 3/9 confirmed), status "PILOT IN · DEEP WIN"
- KM08 data: mean ~67 (approx), job b9db0713, bimodal profile (floors 10/~20, mid 55, catches 92-95), status "PILOT IN · BIMODAL"
- Footer updated: "KM07 ≈
</commit_message>
<xml_diff>
--- a/worlds/korvin-merrow/task-setup/platform/task9/current/golden-KM09-v1.docx
+++ b/worlds/korvin-merrow/task-setup/platform/task9/current/golden-KM09-v1.docx
@@ -478,7 +478,7 @@
           <w:color w:val="4472C4"/>
           <w:sz w:val="20"/>
         </w:rPr>
-        <w:t>Final ICD-10-CM code set with rationale</w:t>
+        <w:t>Principal diagnosis and sequencing rationale</w:t>
       </w:r>
     </w:p>
     <w:p>
@@ -490,7 +490,25 @@
           <w:color w:val="232830"/>
           <w:sz w:val="19"/>
         </w:rPr>
-        <w:t>Principal: N39.0 urinary tract infection, site not specified. The discharge documentation carries the urinary-source infection as suspected at discharge and treated empirically through the stay; under the inpatient rule for diagnoses still suspected at discharge it is coded as established. No physician note documents sepsis as a diagnosis; the record's wording is sepsis physiology, a descriptor, and no organ dysfunction is documented as linked to infection, so A41.9 and R65.2 severe sepsis are not assigned.</w:t>
+        <w:t>Principal: N39.0 urinary tract infection, site not specified. The admission was framed around sepsis, and sepsis is the most severe and highest-weighted candidate for the principal position, but the record documents it only as suspected urinary-source infection and sepsis physiology, a descriptor, and at no point as a confirmed sepsis diagnosis; no organ dysfunction is documented as linked to the infection. Under the inpatient rule, a condition still documented as suspected at discharge is coded as though established, which supports the urinary-source infection as principal. A41.9 sepsis and the R65.2 severe-sepsis codes are not assigned as principal or secondary: sequencing sepsis to principal would overstate the documented severity and would move the encounter into the septicemia DRG family rather than the kidney and urinary tract infection family the documentation supports.</w:t>
+      </w:r>
+    </w:p>
+    <w:p>
+      <w:pPr>
+        <w:spacing w:before="180" w:after="60"/>
+        <w:pBdr>
+          <w:bottom w:val="single" w:sz="6" w:color="C9D4EA" w:space="2"/>
+        </w:pBdr>
+      </w:pPr>
+      <w:r>
+        <w:rPr>
+          <w:rFonts w:ascii="Arial" w:hAnsi="Arial"/>
+          <w:b/>
+          <w:i w:val="0"/>
+          <w:color w:val="4472C4"/>
+          <w:sz w:val="20"/>
+        </w:rPr>
+        <w:t>Secondary diagnoses with rationale</w:t>
       </w:r>
     </w:p>
     <w:p>
@@ -502,7 +520,7 @@
           <w:color w:val="232830"/>
           <w:sz w:val="19"/>
         </w:rPr>
-        <w:t>Secondary diagnoses: N17.9 acute kidney injury (documented, resolved to baseline by laboratory criteria); N18.30 chronic kidney disease stage 3, unspecified a/b (documented baseline); E87.5 hyperkalemia (documented, K 5.1, managed); E86.0 dehydration (documented, treated with cautious fluids); I50.22 chronic systolic heart failure (HFrEF documented as chronic; no acuity or exacerbation documented this admission); I25.10 coronary artery disease with Z95.5 coronary stent status (remote PCI with drug-eluting stent); E11.42 type 2 diabetes with diabetic polyneuropathy (both documented; combination code); D63.1 anemia in chronic kidney disease (documented); G47.33 obstructive sleep apnea (documented, home CPAP); M35.3 polymyalgia rheumatica (documented) with Z79.52 long-term systemic corticosteroid use; M81.0 osteoporosis without current pathological fracture (documented, steroid associated); K21.9 gastroesophageal reflux disease (documented, treated with pantoprazole); R41.82 altered mental status (documented intermittent confusion; coded at symptom level because no encephalopathy diagnosis is documented).</w:t>
+        <w:t>N17.9 acute kidney injury (documented, resolved to baseline by laboratory criteria); N18.30 chronic kidney disease stage 3 (documented baseline); E87.5 hyperkalemia (documented, K 5.1, managed); E86.0 dehydration (documented, treated with cautious fluids); I50.22 chronic systolic heart failure (HFrEF documented as chronic; no acuity or exacerbation documented this admission); I25.10 coronary artery disease with Z95.5 coronary stent status (remote PCI with drug-eluting stent); E11.42 type 2 diabetes with diabetic polyneuropathy (combination code, both documented); D63.1 anemia in chronic kidney disease (documented); G47.33 obstructive sleep apnea (documented, home CPAP); M35.3 polymyalgia rheumatica (documented) with Z79.52 long-term systemic corticosteroid use; M81.0 osteoporosis without current pathological fracture (documented, steroid associated); K21.9 gastroesophageal reflux disease (documented, treated with pantoprazole); R41.82 altered mental status (documented intermittent confusion, coded at symptom level because no encephalopathy diagnosis is documented).</w:t>
       </w:r>
     </w:p>
     <w:p>
@@ -532,7 +550,7 @@
           <w:color w:val="232830"/>
           <w:sz w:val="19"/>
         </w:rPr>
-        <w:t>G93.41 metabolic encephalopathy: not documented anywhere in the record; the documentation supports the symptom code only. I50.23 acute on chronic systolic heart failure: no acute heart failure or exacerbation is documented this admission. A41.9 sepsis and R65.2 severe sepsis: no sepsis diagnosis documented and no documented infection-linked organ dysfunction. Organism codes (B96 series): cultures pending at record close, no speciation documented. Malnutrition codes: no criteria or diagnosis documented.</w:t>
+        <w:t>A41.9 sepsis and the R65.2 severe-sepsis codes: not documented as a diagnosis and no infection-linked organ dysfunction documented; not codeable as principal or secondary (the central sequencing point above). G93.41 metabolic encephalopathy: not documented anywhere in the record; the documentation supports the symptom code R41.82 only. I50.23 acute on chronic systolic heart failure: no acute heart failure or exacerbation documented this admission. Organism codes: cultures pending at record close, no speciation documented. Malnutrition codes: no criteria or diagnosis documented.</w:t>
       </w:r>
     </w:p>
     <w:p>
@@ -562,7 +580,7 @@
           <w:color w:val="232830"/>
           <w:sz w:val="19"/>
         </w:rPr>
-        <w:t>The documented code set groups to the medical kidney and urinary tract infection family (689/690). Without a documented MCC this encounter sits in the without-MCC tier (690). Assigning an undocumented MCC such as G93.41 or I50.23 would shift the tier and is not supported by the record.</w:t>
+        <w:t>On the documented code set the encounter groups to the medical kidney and urinary tract infection family (689/690), and without a documented MCC it sits in the without-MCC tier (690). Two errors would each move it to a higher-weighted tier the record does not support: coding sepsis as principal would group it to the septicemia family (871/872), and assigning an undocumented MCC such as G93.41 or I50.23 would shift 689/690 to the with-MCC tier (689). Neither is supported by the documentation.</w:t>
       </w:r>
     </w:p>
     <w:p>
@@ -574,7 +592,7 @@
           <w:color w:val="232830"/>
           <w:sz w:val="19"/>
         </w:rPr>
-        <w:t>Attested: coding reflects the documented record only; query opportunities, if any, are routed through the documentation integrity process rather than coded.</w:t>
+        <w:t>Attested: coding reflects the documented record only; principal diagnosis is sequenced to the documented suspected urinary-source infection, not to the unconfirmed sepsis framing; query opportunities, if any, are routed through the documentation integrity process rather than coded.</w:t>
       </w:r>
     </w:p>
     <w:p>

</xml_diff>